<commit_message>
feat: digital signature and date formatting in COC
- Insert inspector signature image from Supabase Storage into document
- Format date as D-Mon-YYYY using English month abbreviations (e.g. 9-Mar-2026)
</commit_message>
<xml_diff>
--- a/backend/src/templates/template.docx
+++ b/backend/src/templates/template.docx
@@ -1843,27 +1843,7 @@
                 <w:sz w:val="24"/>
                 <w:szCs w:val="24"/>
               </w:rPr>
-              <w:t>{{</w:t>
-            </w:r>
-            <w:r>
-              <w:rPr>
-                <w:rFonts w:ascii="Arial" w:hAnsi="Arial" w:cs="Arial"/>
-                <w:b/>
-                <w:bCs/>
-                <w:sz w:val="24"/>
-                <w:szCs w:val="24"/>
-              </w:rPr>
-              <w:t>comments</w:t>
-            </w:r>
-            <w:r>
-              <w:rPr>
-                <w:rFonts w:ascii="Arial" w:hAnsi="Arial" w:cs="Arial"/>
-                <w:b/>
-                <w:bCs/>
-                <w:sz w:val="24"/>
-                <w:szCs w:val="24"/>
-              </w:rPr>
-              <w:t>}}</w:t>
+              <w:t>{{comments}}</w:t>
             </w:r>
           </w:p>
         </w:tc>
@@ -1872,12 +1852,50 @@
     <w:p>
       <w:pPr>
         <w:rPr>
-          <w:rFonts w:ascii="Garamond" w:hAnsi="Garamond"/>
+          <w:rFonts w:ascii="Arial" w:hAnsi="Arial" w:cs="Arial"/>
           <w:b/>
-          <w:sz w:val="16"/>
-          <w:szCs w:val="16"/>
+          <w:sz w:val="20"/>
+          <w:szCs w:val="20"/>
         </w:rPr>
       </w:pPr>
+      <w:r>
+        <w:rPr>
+          <w:rFonts w:ascii="Arial" w:hAnsi="Arial" w:cs="Arial"/>
+          <w:b/>
+          <w:sz w:val="20"/>
+          <w:szCs w:val="20"/>
+        </w:rPr>
+        <w:t xml:space="preserve">                       </w:t>
+      </w:r>
+      <w:r>
+        <w:rPr>
+          <w:rFonts w:ascii="Arial" w:hAnsi="Arial" w:cs="Arial"/>
+          <w:b/>
+          <w:sz w:val="20"/>
+          <w:szCs w:val="20"/>
+        </w:rPr>
+        <w:t>{{%</w:t>
+      </w:r>
+      <w:proofErr w:type="spellStart"/>
+      <w:r>
+        <w:rPr>
+          <w:rFonts w:ascii="Arial" w:hAnsi="Arial" w:cs="Arial"/>
+          <w:b/>
+          <w:sz w:val="20"/>
+          <w:szCs w:val="20"/>
+        </w:rPr>
+        <w:t>firma</w:t>
+      </w:r>
+      <w:proofErr w:type="spellEnd"/>
+      <w:r>
+        <w:rPr>
+          <w:rFonts w:ascii="Arial" w:hAnsi="Arial" w:cs="Arial"/>
+          <w:b/>
+          <w:sz w:val="20"/>
+          <w:szCs w:val="20"/>
+        </w:rPr>
+        <w:t>}}</w:t>
+      </w:r>
     </w:p>
     <w:tbl>
       <w:tblPr>
@@ -3054,6 +3072,7 @@
   <w:style w:type="character" w:default="1" w:styleId="DefaultParagraphFont">
     <w:name w:val="Default Paragraph Font"/>
     <w:uiPriority w:val="1"/>
+    <w:semiHidden/>
     <w:unhideWhenUsed/>
   </w:style>
   <w:style w:type="table" w:default="1" w:styleId="TableNormal">
@@ -3551,16 +3570,16 @@
     <w:sig w:usb0="E4002EFF" w:usb1="C200247B" w:usb2="00000009" w:usb3="00000000" w:csb0="000001FF" w:csb1="00000000"/>
   </w:font>
   <w:font w:name="Aptos">
-    <w:altName w:val="Calibri"/>
     <w:charset w:val="00"/>
-    <w:family w:val="roman"/>
-    <w:pitch w:val="default"/>
+    <w:family w:val="swiss"/>
+    <w:pitch w:val="variable"/>
+    <w:sig w:usb0="20000287" w:usb1="00000003" w:usb2="00000000" w:usb3="00000000" w:csb0="0000019F" w:csb1="00000000"/>
   </w:font>
   <w:font w:name="Aptos Display">
-    <w:altName w:val="Calibri"/>
     <w:charset w:val="00"/>
-    <w:family w:val="roman"/>
-    <w:pitch w:val="default"/>
+    <w:family w:val="swiss"/>
+    <w:pitch w:val="variable"/>
+    <w:sig w:usb0="20000287" w:usb1="00000003" w:usb2="00000000" w:usb3="00000000" w:csb0="0000019F" w:csb1="00000000"/>
   </w:font>
 </w:fonts>
 </file>
@@ -3584,14 +3603,30 @@
     <w:rsidRoot w:val="00F75D64"/>
     <w:rsid w:val="000739D9"/>
     <w:rsid w:val="000F5767"/>
+    <w:rsid w:val="00133C55"/>
+    <w:rsid w:val="00204C97"/>
     <w:rsid w:val="00240941"/>
     <w:rsid w:val="00290955"/>
+    <w:rsid w:val="0029249E"/>
     <w:rsid w:val="00400B72"/>
+    <w:rsid w:val="004A5CF1"/>
+    <w:rsid w:val="004E6035"/>
+    <w:rsid w:val="00521D46"/>
     <w:rsid w:val="00543BA0"/>
+    <w:rsid w:val="00560BEB"/>
+    <w:rsid w:val="00621A39"/>
+    <w:rsid w:val="00693895"/>
     <w:rsid w:val="00724504"/>
+    <w:rsid w:val="007833E2"/>
+    <w:rsid w:val="008A2559"/>
+    <w:rsid w:val="00C8714D"/>
+    <w:rsid w:val="00CB1D20"/>
     <w:rsid w:val="00D8674C"/>
+    <w:rsid w:val="00EB1D2A"/>
     <w:rsid w:val="00EE6727"/>
+    <w:rsid w:val="00F13133"/>
     <w:rsid w:val="00F75D64"/>
+    <w:rsid w:val="00F93C02"/>
     <w:rsid w:val="00F95D93"/>
     <w:rsid w:val="00FD044A"/>
   </w:rsids>
@@ -4047,7 +4082,7 @@
     <w:basedOn w:val="DefaultParagraphFont"/>
     <w:uiPriority w:val="99"/>
     <w:semiHidden/>
-    <w:rsid w:val="00EE6727"/>
+    <w:rsid w:val="007833E2"/>
     <w:rPr>
       <w:color w:val="808080"/>
     </w:rPr>
@@ -4061,13 +4096,6 @@
   </w:style>
   <w:style w:type="paragraph" w:customStyle="1" w:styleId="778C36EDE33540AAAA7DBECEAA3518411">
     <w:name w:val="778C36EDE33540AAAA7DBECEAA3518411"/>
-    <w:rsid w:val="00F75D64"/>
-    <w:rPr>
-      <w:rFonts w:eastAsiaTheme="minorHAnsi"/>
-    </w:rPr>
-  </w:style>
-  <w:style w:type="paragraph" w:customStyle="1" w:styleId="9DA201CE569C426E81D209A937B4B90F14">
-    <w:name w:val="9DA201CE569C426E81D209A937B4B90F14"/>
     <w:rsid w:val="00F75D64"/>
     <w:rPr>
       <w:rFonts w:eastAsiaTheme="minorHAnsi"/>

</xml_diff>

<commit_message>
feat: checklist flow with Airtable prefill
- Add checklists table in Supabase
- Add GET /api/checklists/:clienteId route
- Add getChecklists API call in frontend
- Add Checklists.jsx screen with Airtable prefill URL
- Fix auth to return nombre and inicial from usuarios table
- Fix id_empleado to email conversion on login
</commit_message>
<xml_diff>
--- a/backend/src/templates/template.docx
+++ b/backend/src/templates/template.docx
@@ -1623,145 +1623,98 @@
         </w:rPr>
       </w:pPr>
     </w:p>
-    <w:tbl>
-      <w:tblPr>
-        <w:tblStyle w:val="TableGrid"/>
-        <w:tblW w:w="0" w:type="auto"/>
-        <w:tblInd w:w="175" w:type="dxa"/>
-        <w:tblBorders>
-          <w:top w:val="none" w:sz="0" w:space="0" w:color="auto"/>
-          <w:left w:val="none" w:sz="0" w:space="0" w:color="auto"/>
-          <w:bottom w:val="none" w:sz="0" w:space="0" w:color="auto"/>
-          <w:right w:val="none" w:sz="0" w:space="0" w:color="auto"/>
-          <w:insideH w:val="none" w:sz="0" w:space="0" w:color="auto"/>
-          <w:insideV w:val="none" w:sz="0" w:space="0" w:color="auto"/>
-        </w:tblBorders>
-        <w:tblLook w:val="04A0" w:firstRow="1" w:lastRow="0" w:firstColumn="1" w:lastColumn="0" w:noHBand="0" w:noVBand="1"/>
-      </w:tblPr>
-      <w:tblGrid>
-        <w:gridCol w:w="2009"/>
-        <w:gridCol w:w="2518"/>
-        <w:gridCol w:w="2329"/>
-        <w:gridCol w:w="2329"/>
-      </w:tblGrid>
-      <w:tr>
-        <w:tc>
-          <w:tcPr>
-            <w:tcW w:w="2009" w:type="dxa"/>
-          </w:tcPr>
-          <w:p>
-            <w:pPr>
-              <w:rPr>
-                <w:rFonts w:ascii="Garamond" w:hAnsi="Garamond"/>
-                <w:b/>
-                <w:sz w:val="28"/>
-                <w:szCs w:val="28"/>
-              </w:rPr>
-            </w:pPr>
-            <w:r>
-              <w:rPr>
-                <w:rFonts w:ascii="Garamond" w:hAnsi="Garamond"/>
-                <w:b/>
-                <w:sz w:val="28"/>
-                <w:szCs w:val="28"/>
-              </w:rPr>
-              <w:t>Serial Numbers:</w:t>
-            </w:r>
-          </w:p>
-        </w:tc>
-        <w:sdt>
-          <w:sdtPr>
+    <w:p>
+      <w:pPr>
+        <w:rPr>
+          <w:rFonts w:ascii="Garamond" w:hAnsi="Garamond"/>
+          <w:b/>
+          <w:sz w:val="28"/>
+          <w:szCs w:val="28"/>
+        </w:rPr>
+      </w:pPr>
+      <w:r>
+        <w:rPr>
+          <w:rFonts w:ascii="Garamond" w:hAnsi="Garamond"/>
+          <w:b/>
+          <w:sz w:val="28"/>
+          <w:szCs w:val="28"/>
+        </w:rPr>
+        <w:t xml:space="preserve">    </w:t>
+      </w:r>
+      <w:r>
+        <w:rPr>
+          <w:rFonts w:ascii="Garamond" w:hAnsi="Garamond"/>
+          <w:b/>
+          <w:sz w:val="28"/>
+          <w:szCs w:val="28"/>
+        </w:rPr>
+        <w:t xml:space="preserve">Serial Numbers: </w:t>
+      </w:r>
+      <w:sdt>
+        <w:sdtPr>
+          <w:rPr>
+            <w:rFonts w:ascii="Arial" w:hAnsi="Arial" w:cs="Arial"/>
+            <w:b/>
+            <w:sz w:val="24"/>
+            <w:szCs w:val="28"/>
+          </w:rPr>
+          <w:id w:val="-1756732754"/>
+          <w:placeholder>
+            <w:docPart w:val="00DD6825E6D545928888933009C3E940"/>
+          </w:placeholder>
+          <w:text/>
+        </w:sdtPr>
+        <w:sdtContent>
+          <w:r>
             <w:rPr>
               <w:rFonts w:ascii="Arial" w:hAnsi="Arial" w:cs="Arial"/>
               <w:b/>
               <w:sz w:val="24"/>
-              <w:szCs w:val="24"/>
+              <w:szCs w:val="28"/>
             </w:rPr>
-            <w:id w:val="882216519"/>
-            <w:placeholder>
-              <w:docPart w:val="FC7F715554634E60B1359ED2D1B60E5C"/>
-            </w:placeholder>
-            <w:text/>
-          </w:sdtPr>
-          <w:sdtContent>
-            <w:tc>
-              <w:tcPr>
-                <w:tcW w:w="2518" w:type="dxa"/>
-              </w:tcPr>
-              <w:p>
-                <w:pPr>
-                  <w:rPr>
-                    <w:rFonts w:ascii="Garamond" w:hAnsi="Garamond"/>
-                    <w:b/>
-                    <w:sz w:val="28"/>
-                    <w:szCs w:val="28"/>
-                  </w:rPr>
-                </w:pPr>
-                <w:r>
-                  <w:rPr>
-                    <w:rFonts w:ascii="Arial" w:hAnsi="Arial" w:cs="Arial"/>
-                    <w:b/>
-                    <w:sz w:val="24"/>
-                    <w:szCs w:val="24"/>
-                  </w:rPr>
-                  <w:t>{{</w:t>
-                </w:r>
-                <w:proofErr w:type="spellStart"/>
-                <w:r>
-                  <w:rPr>
-                    <w:rFonts w:ascii="Arial" w:hAnsi="Arial" w:cs="Arial"/>
-                    <w:b/>
-                    <w:sz w:val="24"/>
-                    <w:szCs w:val="24"/>
-                  </w:rPr>
-                  <w:t>serial_numbers</w:t>
-                </w:r>
-                <w:proofErr w:type="spellEnd"/>
-                <w:r>
-                  <w:rPr>
-                    <w:rFonts w:ascii="Arial" w:hAnsi="Arial" w:cs="Arial"/>
-                    <w:b/>
-                    <w:sz w:val="24"/>
-                    <w:szCs w:val="24"/>
-                  </w:rPr>
-                  <w:t>}}</w:t>
-                </w:r>
-              </w:p>
-            </w:tc>
-          </w:sdtContent>
-        </w:sdt>
-        <w:tc>
-          <w:tcPr>
-            <w:tcW w:w="2329" w:type="dxa"/>
-          </w:tcPr>
-          <w:p>
-            <w:pPr>
-              <w:rPr>
-                <w:rFonts w:ascii="Arial" w:hAnsi="Arial" w:cs="Arial"/>
-                <w:b/>
-                <w:sz w:val="24"/>
-                <w:szCs w:val="24"/>
-              </w:rPr>
-            </w:pPr>
-          </w:p>
-        </w:tc>
-        <w:tc>
-          <w:tcPr>
-            <w:tcW w:w="2329" w:type="dxa"/>
-          </w:tcPr>
-          <w:p>
-            <w:pPr>
-              <w:rPr>
-                <w:rFonts w:ascii="Arial" w:hAnsi="Arial" w:cs="Arial"/>
-                <w:b/>
-                <w:sz w:val="24"/>
-                <w:szCs w:val="24"/>
-              </w:rPr>
-            </w:pPr>
-          </w:p>
-        </w:tc>
-      </w:tr>
-    </w:tbl>
+            <w:t>{{</w:t>
+          </w:r>
+          <w:proofErr w:type="spellStart"/>
+          <w:r>
+            <w:rPr>
+              <w:rFonts w:ascii="Arial" w:hAnsi="Arial" w:cs="Arial"/>
+              <w:b/>
+              <w:sz w:val="24"/>
+              <w:szCs w:val="28"/>
+            </w:rPr>
+            <w:t>serial</w:t>
+          </w:r>
+          <w:r>
+            <w:rPr>
+              <w:rFonts w:ascii="Arial" w:hAnsi="Arial" w:cs="Arial"/>
+              <w:b/>
+              <w:sz w:val="24"/>
+              <w:szCs w:val="28"/>
+            </w:rPr>
+            <w:t>_n</w:t>
+          </w:r>
+          <w:r>
+            <w:rPr>
+              <w:rFonts w:ascii="Arial" w:hAnsi="Arial" w:cs="Arial"/>
+              <w:b/>
+              <w:sz w:val="24"/>
+              <w:szCs w:val="28"/>
+            </w:rPr>
+            <w:t>umbers</w:t>
+          </w:r>
+          <w:proofErr w:type="spellEnd"/>
+          <w:r>
+            <w:rPr>
+              <w:rFonts w:ascii="Arial" w:hAnsi="Arial" w:cs="Arial"/>
+              <w:b/>
+              <w:sz w:val="24"/>
+              <w:szCs w:val="28"/>
+            </w:rPr>
+            <w:t>}}</w:t>
+          </w:r>
+        </w:sdtContent>
+      </w:sdt>
+    </w:p>
     <w:p>
       <w:pPr>
         <w:rPr>
@@ -3480,7 +3433,7 @@
     </w:docPart>
     <w:docPart>
       <w:docPartPr>
-        <w:name w:val="FC7F715554634E60B1359ED2D1B60E5C"/>
+        <w:name w:val="00DD6825E6D545928888933009C3E940"/>
         <w:category>
           <w:name w:val="General"/>
           <w:gallery w:val="placeholder"/>
@@ -3491,32 +3444,19 @@
         <w:behaviors>
           <w:behavior w:val="content"/>
         </w:behaviors>
-        <w:guid w:val="{8CB9CE0B-7840-4896-BB93-1893D44E22C9}"/>
+        <w:guid w:val="{0644A7E4-775D-4141-8872-74B3B0FDA3F4}"/>
       </w:docPartPr>
       <w:docPartBody>
         <w:p>
           <w:pPr>
-            <w:pStyle w:val="FC7F715554634E60B1359ED2D1B60E5C"/>
+            <w:pStyle w:val="00DD6825E6D545928888933009C3E940"/>
           </w:pPr>
           <w:r>
             <w:rPr>
               <w:rStyle w:val="PlaceholderText"/>
               <w:rFonts w:ascii="Arial" w:hAnsi="Arial" w:cs="Arial"/>
-              <w:sz w:val="24"/>
-              <w:szCs w:val="24"/>
-              <w:lang w:val="es-MX"/>
             </w:rPr>
-            <w:t>Numero de Serie (si Aplica:</w:t>
-          </w:r>
-          <w:r>
-            <w:rPr>
-              <w:rStyle w:val="PlaceholderText"/>
-              <w:rFonts w:ascii="Arial" w:hAnsi="Arial" w:cs="Arial"/>
-              <w:sz w:val="24"/>
-              <w:szCs w:val="24"/>
-              <w:lang w:val="es-MX"/>
-            </w:rPr>
-            <w:t>)</w:t>
+            <w:t>No.Dibujo</w:t>
           </w:r>
         </w:p>
       </w:docPartBody>
@@ -3616,8 +3556,11 @@
     <w:rsid w:val="00560BEB"/>
     <w:rsid w:val="00621A39"/>
     <w:rsid w:val="00693895"/>
+    <w:rsid w:val="006D3AAF"/>
     <w:rsid w:val="00724504"/>
     <w:rsid w:val="007833E2"/>
+    <w:rsid w:val="007A7A4F"/>
+    <w:rsid w:val="00855AE8"/>
     <w:rsid w:val="008A2559"/>
     <w:rsid w:val="00C8714D"/>
     <w:rsid w:val="00CB1D20"/>
@@ -4082,7 +4025,7 @@
     <w:basedOn w:val="DefaultParagraphFont"/>
     <w:uiPriority w:val="99"/>
     <w:semiHidden/>
-    <w:rsid w:val="007833E2"/>
+    <w:rsid w:val="006D3AAF"/>
     <w:rPr>
       <w:color w:val="808080"/>
     </w:rPr>
@@ -4139,6 +4082,19 @@
   <w:style w:type="paragraph" w:customStyle="1" w:styleId="FC7F715554634E60B1359ED2D1B60E5C">
     <w:name w:val="FC7F715554634E60B1359ED2D1B60E5C"/>
     <w:rsid w:val="00EE6727"/>
+  </w:style>
+  <w:style w:type="paragraph" w:customStyle="1" w:styleId="00DD6825E6D545928888933009C3E940">
+    <w:name w:val="00DD6825E6D545928888933009C3E940"/>
+    <w:rsid w:val="006D3AAF"/>
+    <w:pPr>
+      <w:spacing w:line="278" w:lineRule="auto"/>
+    </w:pPr>
+    <w:rPr>
+      <w:kern w:val="2"/>
+      <w:sz w:val="24"/>
+      <w:szCs w:val="24"/>
+      <w14:ligatures w14:val="standardContextual"/>
+    </w:rPr>
   </w:style>
 </w:styles>
 </file>

</xml_diff>

<commit_message>
refactor: complete translation of certificate generation flow to English
- Refactor GenerateCOC.jsx component, including state management and UI documentation.
- Update certificates.js API route with English technical comments.
- Standardize certificate.js service logic and documentation for template rendering.
- Maintain original data schema for backend and database compatibility.
</commit_message>
<xml_diff>
--- a/backend/src/templates/template.docx
+++ b/backend/src/templates/template.docx
@@ -60,21 +60,12 @@
                                 <w:lang w:val="es-MX"/>
                               </w:rPr>
                             </w:pPr>
-                            <w:proofErr w:type="spellStart"/>
                             <w:r>
                               <w:rPr>
                                 <w:rFonts w:ascii="Times New Roman" w:hAnsi="Times New Roman" w:cs="Times New Roman"/>
                                 <w:lang w:val="es-MX"/>
                               </w:rPr>
-                              <w:t>Carr</w:t>
-                            </w:r>
-                            <w:proofErr w:type="spellEnd"/>
-                            <w:r>
-                              <w:rPr>
-                                <w:rFonts w:ascii="Times New Roman" w:hAnsi="Times New Roman" w:cs="Times New Roman"/>
-                                <w:lang w:val="es-MX"/>
-                              </w:rPr>
-                              <w:t>. Internacional KM 129 Salida Norte</w:t>
+                              <w:t>Carr. Internacional KM 129 Salida Norte</w:t>
                             </w:r>
                           </w:p>
                           <w:p>
@@ -324,29 +315,7 @@
                 <w:sz w:val="28"/>
                 <w:szCs w:val="28"/>
               </w:rPr>
-              <w:t xml:space="preserve">drawing and has been processed </w:t>
-            </w:r>
-            <w:proofErr w:type="gramStart"/>
-            <w:r>
-              <w:rPr>
-                <w:rFonts w:ascii="Garamond" w:eastAsia="Times New Roman" w:hAnsi="Garamond" w:cs="Arial"/>
-                <w:b/>
-                <w:bCs/>
-                <w:sz w:val="28"/>
-                <w:szCs w:val="28"/>
-              </w:rPr>
-              <w:t>in  accordance</w:t>
-            </w:r>
-            <w:proofErr w:type="gramEnd"/>
-            <w:r>
-              <w:rPr>
-                <w:rFonts w:ascii="Garamond" w:eastAsia="Times New Roman" w:hAnsi="Garamond" w:cs="Arial"/>
-                <w:b/>
-                <w:bCs/>
-                <w:sz w:val="28"/>
-                <w:szCs w:val="28"/>
-              </w:rPr>
-              <w:t xml:space="preserve"> with applicable</w:t>
+              <w:t>drawing and has been processed in  accordance with applicable</w:t>
             </w:r>
           </w:p>
         </w:tc>
@@ -692,29 +661,7 @@
                 <w:sz w:val="28"/>
                 <w:szCs w:val="28"/>
               </w:rPr>
-              <w:t>Reports, Final Inspection and/or sub-</w:t>
-            </w:r>
-            <w:proofErr w:type="spellStart"/>
-            <w:r>
-              <w:rPr>
-                <w:rFonts w:ascii="Garamond" w:eastAsia="Times New Roman" w:hAnsi="Garamond" w:cs="Arial"/>
-                <w:b/>
-                <w:bCs/>
-                <w:sz w:val="28"/>
-                <w:szCs w:val="28"/>
-              </w:rPr>
-              <w:t>teir</w:t>
-            </w:r>
-            <w:proofErr w:type="spellEnd"/>
-            <w:r>
-              <w:rPr>
-                <w:rFonts w:ascii="Garamond" w:eastAsia="Times New Roman" w:hAnsi="Garamond" w:cs="Arial"/>
-                <w:b/>
-                <w:bCs/>
-                <w:sz w:val="28"/>
-                <w:szCs w:val="28"/>
-              </w:rPr>
-              <w:t xml:space="preserve"> Supplier Certificates of </w:t>
+              <w:t xml:space="preserve">Reports, Final Inspection and/or sub-teir Supplier Certificates of </w:t>
             </w:r>
           </w:p>
         </w:tc>
@@ -743,7 +690,6 @@
                 <w:szCs w:val="28"/>
               </w:rPr>
             </w:pPr>
-            <w:proofErr w:type="gramStart"/>
             <w:r>
               <w:rPr>
                 <w:rFonts w:ascii="Garamond" w:eastAsia="Times New Roman" w:hAnsi="Garamond" w:cs="Arial"/>
@@ -752,40 +698,7 @@
                 <w:sz w:val="28"/>
                 <w:szCs w:val="28"/>
               </w:rPr>
-              <w:t>Conformance</w:t>
-            </w:r>
-            <w:proofErr w:type="gramEnd"/>
-            <w:r>
-              <w:rPr>
-                <w:rFonts w:ascii="Garamond" w:eastAsia="Times New Roman" w:hAnsi="Garamond" w:cs="Arial"/>
-                <w:b/>
-                <w:bCs/>
-                <w:sz w:val="28"/>
-                <w:szCs w:val="28"/>
-              </w:rPr>
-              <w:t xml:space="preserve"> </w:t>
-            </w:r>
-            <w:proofErr w:type="gramStart"/>
-            <w:r>
-              <w:rPr>
-                <w:rFonts w:ascii="Garamond" w:eastAsia="Times New Roman" w:hAnsi="Garamond" w:cs="Arial"/>
-                <w:b/>
-                <w:bCs/>
-                <w:sz w:val="28"/>
-                <w:szCs w:val="28"/>
-              </w:rPr>
-              <w:t>are</w:t>
-            </w:r>
-            <w:proofErr w:type="gramEnd"/>
-            <w:r>
-              <w:rPr>
-                <w:rFonts w:ascii="Garamond" w:eastAsia="Times New Roman" w:hAnsi="Garamond" w:cs="Arial"/>
-                <w:b/>
-                <w:bCs/>
-                <w:sz w:val="28"/>
-                <w:szCs w:val="28"/>
-              </w:rPr>
-              <w:t xml:space="preserve"> on file and available for review upon request.</w:t>
+              <w:t>Conformance are on file and available for review upon request.</w:t>
             </w:r>
           </w:p>
         </w:tc>
@@ -930,29 +843,7 @@
                     <w:sz w:val="24"/>
                     <w:szCs w:val="24"/>
                   </w:rPr>
-                  <w:t>{{</w:t>
-                </w:r>
-                <w:proofErr w:type="spellStart"/>
-                <w:r>
-                  <w:rPr>
-                    <w:rFonts w:ascii="Arial" w:hAnsi="Arial" w:cs="Arial"/>
-                    <w:b/>
-                    <w:bCs/>
-                    <w:sz w:val="24"/>
-                    <w:szCs w:val="24"/>
-                  </w:rPr>
-                  <w:t>customer_name</w:t>
-                </w:r>
-                <w:proofErr w:type="spellEnd"/>
-                <w:r>
-                  <w:rPr>
-                    <w:rFonts w:ascii="Arial" w:hAnsi="Arial" w:cs="Arial"/>
-                    <w:b/>
-                    <w:bCs/>
-                    <w:sz w:val="24"/>
-                    <w:szCs w:val="24"/>
-                  </w:rPr>
-                  <w:t>}}</w:t>
+                  <w:t>{{customer_name}}</w:t>
                 </w:r>
               </w:p>
             </w:tc>
@@ -1006,29 +897,7 @@
                 <w:sz w:val="24"/>
                 <w:szCs w:val="24"/>
               </w:rPr>
-              <w:t>{{</w:t>
-            </w:r>
-            <w:proofErr w:type="spellStart"/>
-            <w:r>
-              <w:rPr>
-                <w:rFonts w:ascii="Arial" w:hAnsi="Arial" w:cs="Arial"/>
-                <w:b/>
-                <w:bCs/>
-                <w:sz w:val="24"/>
-                <w:szCs w:val="24"/>
-              </w:rPr>
-              <w:t>purchase_order</w:t>
-            </w:r>
-            <w:proofErr w:type="spellEnd"/>
-            <w:r>
-              <w:rPr>
-                <w:rFonts w:ascii="Arial" w:hAnsi="Arial" w:cs="Arial"/>
-                <w:b/>
-                <w:bCs/>
-                <w:sz w:val="24"/>
-                <w:szCs w:val="24"/>
-              </w:rPr>
-              <w:t>}}</w:t>
+              <w:t>{{purchase_order}}</w:t>
             </w:r>
           </w:p>
         </w:tc>
@@ -1100,27 +969,7 @@
                     <w:sz w:val="24"/>
                     <w:szCs w:val="24"/>
                   </w:rPr>
-                  <w:t>{{</w:t>
-                </w:r>
-                <w:proofErr w:type="spellStart"/>
-                <w:r>
-                  <w:rPr>
-                    <w:rFonts w:ascii="Arial" w:hAnsi="Arial" w:cs="Arial"/>
-                    <w:b/>
-                    <w:sz w:val="24"/>
-                    <w:szCs w:val="24"/>
-                  </w:rPr>
-                  <w:t>packing_slip</w:t>
-                </w:r>
-                <w:proofErr w:type="spellEnd"/>
-                <w:r>
-                  <w:rPr>
-                    <w:rFonts w:ascii="Arial" w:hAnsi="Arial" w:cs="Arial"/>
-                    <w:b/>
-                    <w:sz w:val="24"/>
-                    <w:szCs w:val="24"/>
-                  </w:rPr>
-                  <w:t>}}</w:t>
+                  <w:t>{{packing_slip}}</w:t>
                 </w:r>
               </w:p>
             </w:tc>
@@ -1176,7 +1025,6 @@
               </w:rPr>
               <w:t>{{</w:t>
             </w:r>
-            <w:proofErr w:type="spellStart"/>
             <w:r>
               <w:rPr>
                 <w:rFonts w:ascii="Arial" w:hAnsi="Arial" w:cs="Arial"/>
@@ -1187,7 +1035,6 @@
               </w:rPr>
               <w:t>sales_order</w:t>
             </w:r>
-            <w:proofErr w:type="spellEnd"/>
             <w:r>
               <w:rPr>
                 <w:rFonts w:ascii="Arial" w:hAnsi="Arial" w:cs="Arial"/>
@@ -1248,29 +1095,7 @@
                 <w:sz w:val="24"/>
                 <w:szCs w:val="24"/>
               </w:rPr>
-              <w:t>{{</w:t>
-            </w:r>
-            <w:proofErr w:type="spellStart"/>
-            <w:r>
-              <w:rPr>
-                <w:rFonts w:ascii="Arial" w:hAnsi="Arial" w:cs="Arial"/>
-                <w:b/>
-                <w:bCs/>
-                <w:sz w:val="24"/>
-                <w:szCs w:val="24"/>
-              </w:rPr>
-              <w:t>date_code</w:t>
-            </w:r>
-            <w:proofErr w:type="spellEnd"/>
-            <w:r>
-              <w:rPr>
-                <w:rFonts w:ascii="Arial" w:hAnsi="Arial" w:cs="Arial"/>
-                <w:b/>
-                <w:bCs/>
-                <w:sz w:val="24"/>
-                <w:szCs w:val="24"/>
-              </w:rPr>
-              <w:t>}}</w:t>
+              <w:t>{{date_code}}</w:t>
             </w:r>
           </w:p>
         </w:tc>
@@ -1335,27 +1160,7 @@
                     <w:sz w:val="24"/>
                     <w:szCs w:val="28"/>
                   </w:rPr>
-                  <w:t>{{</w:t>
-                </w:r>
-                <w:proofErr w:type="spellStart"/>
-                <w:r>
-                  <w:rPr>
-                    <w:rFonts w:ascii="Arial" w:hAnsi="Arial" w:cs="Arial"/>
-                    <w:b/>
-                    <w:sz w:val="24"/>
-                    <w:szCs w:val="28"/>
-                  </w:rPr>
-                  <w:t>part_number</w:t>
-                </w:r>
-                <w:proofErr w:type="spellEnd"/>
-                <w:r>
-                  <w:rPr>
-                    <w:rFonts w:ascii="Arial" w:hAnsi="Arial" w:cs="Arial"/>
-                    <w:b/>
-                    <w:sz w:val="24"/>
-                    <w:szCs w:val="28"/>
-                  </w:rPr>
-                  <w:t>}}</w:t>
+                  <w:t>{{part_number}}</w:t>
                 </w:r>
               </w:p>
             </w:tc>
@@ -1488,27 +1293,7 @@
                     <w:sz w:val="24"/>
                     <w:szCs w:val="28"/>
                   </w:rPr>
-                  <w:t>{{</w:t>
-                </w:r>
-                <w:proofErr w:type="spellStart"/>
-                <w:r>
-                  <w:rPr>
-                    <w:rFonts w:ascii="Arial" w:hAnsi="Arial" w:cs="Arial"/>
-                    <w:b/>
-                    <w:sz w:val="24"/>
-                    <w:szCs w:val="28"/>
-                  </w:rPr>
-                  <w:t>drawing_no</w:t>
-                </w:r>
-                <w:proofErr w:type="spellEnd"/>
-                <w:r>
-                  <w:rPr>
-                    <w:rFonts w:ascii="Arial" w:hAnsi="Arial" w:cs="Arial"/>
-                    <w:b/>
-                    <w:sz w:val="24"/>
-                    <w:szCs w:val="28"/>
-                  </w:rPr>
-                  <w:t>}}</w:t>
+                  <w:t>{{drawing_no}}</w:t>
                 </w:r>
               </w:p>
             </w:tc>
@@ -1562,29 +1347,7 @@
                 <w:sz w:val="24"/>
                 <w:szCs w:val="24"/>
               </w:rPr>
-              <w:t>{{</w:t>
-            </w:r>
-            <w:proofErr w:type="spellStart"/>
-            <w:r>
-              <w:rPr>
-                <w:rFonts w:ascii="Arial" w:hAnsi="Arial" w:cs="Arial"/>
-                <w:b/>
-                <w:bCs/>
-                <w:sz w:val="24"/>
-                <w:szCs w:val="24"/>
-              </w:rPr>
-              <w:t>work_order</w:t>
-            </w:r>
-            <w:proofErr w:type="spellEnd"/>
-            <w:r>
-              <w:rPr>
-                <w:rFonts w:ascii="Arial" w:hAnsi="Arial" w:cs="Arial"/>
-                <w:b/>
-                <w:bCs/>
-                <w:sz w:val="24"/>
-                <w:szCs w:val="24"/>
-              </w:rPr>
-              <w:t>}}</w:t>
+              <w:t>{{work_order}}</w:t>
             </w:r>
           </w:p>
         </w:tc>
@@ -1639,16 +1402,7 @@
           <w:sz w:val="28"/>
           <w:szCs w:val="28"/>
         </w:rPr>
-        <w:t xml:space="preserve">    </w:t>
-      </w:r>
-      <w:r>
-        <w:rPr>
-          <w:rFonts w:ascii="Garamond" w:hAnsi="Garamond"/>
-          <w:b/>
-          <w:sz w:val="28"/>
-          <w:szCs w:val="28"/>
-        </w:rPr>
-        <w:t xml:space="preserve">Serial Numbers: </w:t>
+        <w:t xml:space="preserve">    Serial Numbers: </w:t>
       </w:r>
       <w:sdt>
         <w:sdtPr>
@@ -1674,7 +1428,6 @@
             </w:rPr>
             <w:t>{{</w:t>
           </w:r>
-          <w:proofErr w:type="spellStart"/>
           <w:r>
             <w:rPr>
               <w:rFonts w:ascii="Arial" w:hAnsi="Arial" w:cs="Arial"/>
@@ -1702,7 +1455,6 @@
             </w:rPr>
             <w:t>umbers</w:t>
           </w:r>
-          <w:proofErr w:type="spellEnd"/>
           <w:r>
             <w:rPr>
               <w:rFonts w:ascii="Arial" w:hAnsi="Arial" w:cs="Arial"/>
@@ -1827,9 +1579,8 @@
           <w:sz w:val="20"/>
           <w:szCs w:val="20"/>
         </w:rPr>
-        <w:t>{{%</w:t>
+        <w:t>{{</w:t>
       </w:r>
-      <w:proofErr w:type="spellStart"/>
       <w:r>
         <w:rPr>
           <w:rFonts w:ascii="Arial" w:hAnsi="Arial" w:cs="Arial"/>
@@ -1837,9 +1588,17 @@
           <w:sz w:val="20"/>
           <w:szCs w:val="20"/>
         </w:rPr>
-        <w:t>firma</w:t>
+        <w:t>%</w:t>
       </w:r>
-      <w:proofErr w:type="spellEnd"/>
+      <w:r>
+        <w:rPr>
+          <w:rFonts w:ascii="Arial" w:hAnsi="Arial" w:cs="Arial"/>
+          <w:b/>
+          <w:sz w:val="20"/>
+          <w:szCs w:val="20"/>
+        </w:rPr>
+        <w:t>signature</w:t>
+      </w:r>
       <w:r>
         <w:rPr>
           <w:rFonts w:ascii="Arial" w:hAnsi="Arial" w:cs="Arial"/>
@@ -3542,12 +3301,15 @@
   <w:rsids>
     <w:rsidRoot w:val="00F75D64"/>
     <w:rsid w:val="000739D9"/>
+    <w:rsid w:val="000D41DB"/>
     <w:rsid w:val="000F5767"/>
     <w:rsid w:val="00133C55"/>
     <w:rsid w:val="00204C97"/>
     <w:rsid w:val="00240941"/>
     <w:rsid w:val="00290955"/>
     <w:rsid w:val="0029249E"/>
+    <w:rsid w:val="002B58DB"/>
+    <w:rsid w:val="003E4B46"/>
     <w:rsid w:val="00400B72"/>
     <w:rsid w:val="004A5CF1"/>
     <w:rsid w:val="004E6035"/>
@@ -3564,6 +3326,8 @@
     <w:rsid w:val="008A2559"/>
     <w:rsid w:val="00C8714D"/>
     <w:rsid w:val="00CB1D20"/>
+    <w:rsid w:val="00CE7989"/>
+    <w:rsid w:val="00D36960"/>
     <w:rsid w:val="00D8674C"/>
     <w:rsid w:val="00EB1D2A"/>
     <w:rsid w:val="00EE6727"/>
@@ -4079,10 +3843,6 @@
       <w:rFonts w:eastAsiaTheme="minorHAnsi"/>
     </w:rPr>
   </w:style>
-  <w:style w:type="paragraph" w:customStyle="1" w:styleId="FC7F715554634E60B1359ED2D1B60E5C">
-    <w:name w:val="FC7F715554634E60B1359ED2D1B60E5C"/>
-    <w:rsid w:val="00EE6727"/>
-  </w:style>
   <w:style w:type="paragraph" w:customStyle="1" w:styleId="00DD6825E6D545928888933009C3E940">
     <w:name w:val="00DD6825E6D545928888933009C3E940"/>
     <w:rsid w:val="006D3AAF"/>

</xml_diff>

<commit_message>
feat: integrate Smartsheet for automatic certificate storage - Add Smartsheet service with functions for folder and sheet management - Implement automatic folder creation by month (e.g., "Marzo 2026") - Implement automatic sheet creation by day (e.g., "2026-03-26") - Add row insertion with certificate data (Inspector, Part No, Drawing No, Cliente, Fecha) - Add file attachment to row for PDF certificates - Integrate saveCertificate flow into certificate generation endpoint - Set certificate filename format to COC_{part_number}.docx
</commit_message>
<xml_diff>
--- a/backend/src/templates/template.docx
+++ b/backend/src/templates/template.docx
@@ -60,12 +60,21 @@
                                 <w:lang w:val="es-MX"/>
                               </w:rPr>
                             </w:pPr>
+                            <w:proofErr w:type="spellStart"/>
                             <w:r>
                               <w:rPr>
                                 <w:rFonts w:ascii="Times New Roman" w:hAnsi="Times New Roman" w:cs="Times New Roman"/>
                                 <w:lang w:val="es-MX"/>
                               </w:rPr>
-                              <w:t>Carr. Internacional KM 129 Salida Norte</w:t>
+                              <w:t>Carr</w:t>
+                            </w:r>
+                            <w:proofErr w:type="spellEnd"/>
+                            <w:r>
+                              <w:rPr>
+                                <w:rFonts w:ascii="Times New Roman" w:hAnsi="Times New Roman" w:cs="Times New Roman"/>
+                                <w:lang w:val="es-MX"/>
+                              </w:rPr>
+                              <w:t>. Internacional KM 129 Salida Norte</w:t>
                             </w:r>
                           </w:p>
                           <w:p>
@@ -315,7 +324,29 @@
                 <w:sz w:val="28"/>
                 <w:szCs w:val="28"/>
               </w:rPr>
-              <w:t>drawing and has been processed in  accordance with applicable</w:t>
+              <w:t xml:space="preserve">drawing and has been processed </w:t>
+            </w:r>
+            <w:proofErr w:type="gramStart"/>
+            <w:r>
+              <w:rPr>
+                <w:rFonts w:ascii="Garamond" w:eastAsia="Times New Roman" w:hAnsi="Garamond" w:cs="Arial"/>
+                <w:b/>
+                <w:bCs/>
+                <w:sz w:val="28"/>
+                <w:szCs w:val="28"/>
+              </w:rPr>
+              <w:t>in  accordance</w:t>
+            </w:r>
+            <w:proofErr w:type="gramEnd"/>
+            <w:r>
+              <w:rPr>
+                <w:rFonts w:ascii="Garamond" w:eastAsia="Times New Roman" w:hAnsi="Garamond" w:cs="Arial"/>
+                <w:b/>
+                <w:bCs/>
+                <w:sz w:val="28"/>
+                <w:szCs w:val="28"/>
+              </w:rPr>
+              <w:t xml:space="preserve"> with applicable</w:t>
             </w:r>
           </w:p>
         </w:tc>
@@ -661,7 +692,27 @@
                 <w:sz w:val="28"/>
                 <w:szCs w:val="28"/>
               </w:rPr>
-              <w:t xml:space="preserve">Reports, Final Inspection and/or sub-teir Supplier Certificates of </w:t>
+              <w:t>Reports, Final Inspection and/or sub-ti</w:t>
+            </w:r>
+            <w:r>
+              <w:rPr>
+                <w:rFonts w:ascii="Garamond" w:eastAsia="Times New Roman" w:hAnsi="Garamond" w:cs="Arial"/>
+                <w:b/>
+                <w:bCs/>
+                <w:sz w:val="28"/>
+                <w:szCs w:val="28"/>
+              </w:rPr>
+              <w:t>e</w:t>
+            </w:r>
+            <w:r>
+              <w:rPr>
+                <w:rFonts w:ascii="Garamond" w:eastAsia="Times New Roman" w:hAnsi="Garamond" w:cs="Arial"/>
+                <w:b/>
+                <w:bCs/>
+                <w:sz w:val="28"/>
+                <w:szCs w:val="28"/>
+              </w:rPr>
+              <w:t xml:space="preserve">r Supplier Certificates of </w:t>
             </w:r>
           </w:p>
         </w:tc>
@@ -690,6 +741,7 @@
                 <w:szCs w:val="28"/>
               </w:rPr>
             </w:pPr>
+            <w:proofErr w:type="gramStart"/>
             <w:r>
               <w:rPr>
                 <w:rFonts w:ascii="Garamond" w:eastAsia="Times New Roman" w:hAnsi="Garamond" w:cs="Arial"/>
@@ -698,7 +750,40 @@
                 <w:sz w:val="28"/>
                 <w:szCs w:val="28"/>
               </w:rPr>
-              <w:t>Conformance are on file and available for review upon request.</w:t>
+              <w:t>Conformance</w:t>
+            </w:r>
+            <w:proofErr w:type="gramEnd"/>
+            <w:r>
+              <w:rPr>
+                <w:rFonts w:ascii="Garamond" w:eastAsia="Times New Roman" w:hAnsi="Garamond" w:cs="Arial"/>
+                <w:b/>
+                <w:bCs/>
+                <w:sz w:val="28"/>
+                <w:szCs w:val="28"/>
+              </w:rPr>
+              <w:t xml:space="preserve"> </w:t>
+            </w:r>
+            <w:proofErr w:type="gramStart"/>
+            <w:r>
+              <w:rPr>
+                <w:rFonts w:ascii="Garamond" w:eastAsia="Times New Roman" w:hAnsi="Garamond" w:cs="Arial"/>
+                <w:b/>
+                <w:bCs/>
+                <w:sz w:val="28"/>
+                <w:szCs w:val="28"/>
+              </w:rPr>
+              <w:t>are</w:t>
+            </w:r>
+            <w:proofErr w:type="gramEnd"/>
+            <w:r>
+              <w:rPr>
+                <w:rFonts w:ascii="Garamond" w:eastAsia="Times New Roman" w:hAnsi="Garamond" w:cs="Arial"/>
+                <w:b/>
+                <w:bCs/>
+                <w:sz w:val="28"/>
+                <w:szCs w:val="28"/>
+              </w:rPr>
+              <w:t xml:space="preserve"> on file and available for review upon request.</w:t>
             </w:r>
           </w:p>
         </w:tc>
@@ -843,7 +928,29 @@
                     <w:sz w:val="24"/>
                     <w:szCs w:val="24"/>
                   </w:rPr>
-                  <w:t>{{customer_name}}</w:t>
+                  <w:t>{{</w:t>
+                </w:r>
+                <w:proofErr w:type="spellStart"/>
+                <w:r>
+                  <w:rPr>
+                    <w:rFonts w:ascii="Arial" w:hAnsi="Arial" w:cs="Arial"/>
+                    <w:b/>
+                    <w:bCs/>
+                    <w:sz w:val="24"/>
+                    <w:szCs w:val="24"/>
+                  </w:rPr>
+                  <w:t>customer_name</w:t>
+                </w:r>
+                <w:proofErr w:type="spellEnd"/>
+                <w:r>
+                  <w:rPr>
+                    <w:rFonts w:ascii="Arial" w:hAnsi="Arial" w:cs="Arial"/>
+                    <w:b/>
+                    <w:bCs/>
+                    <w:sz w:val="24"/>
+                    <w:szCs w:val="24"/>
+                  </w:rPr>
+                  <w:t>}}</w:t>
                 </w:r>
               </w:p>
             </w:tc>
@@ -897,7 +1004,29 @@
                 <w:sz w:val="24"/>
                 <w:szCs w:val="24"/>
               </w:rPr>
-              <w:t>{{purchase_order}}</w:t>
+              <w:t>{{</w:t>
+            </w:r>
+            <w:proofErr w:type="spellStart"/>
+            <w:r>
+              <w:rPr>
+                <w:rFonts w:ascii="Arial" w:hAnsi="Arial" w:cs="Arial"/>
+                <w:b/>
+                <w:bCs/>
+                <w:sz w:val="24"/>
+                <w:szCs w:val="24"/>
+              </w:rPr>
+              <w:t>purchase_order</w:t>
+            </w:r>
+            <w:proofErr w:type="spellEnd"/>
+            <w:r>
+              <w:rPr>
+                <w:rFonts w:ascii="Arial" w:hAnsi="Arial" w:cs="Arial"/>
+                <w:b/>
+                <w:bCs/>
+                <w:sz w:val="24"/>
+                <w:szCs w:val="24"/>
+              </w:rPr>
+              <w:t>}}</w:t>
             </w:r>
           </w:p>
         </w:tc>
@@ -969,7 +1098,27 @@
                     <w:sz w:val="24"/>
                     <w:szCs w:val="24"/>
                   </w:rPr>
-                  <w:t>{{packing_slip}}</w:t>
+                  <w:t>{{</w:t>
+                </w:r>
+                <w:proofErr w:type="spellStart"/>
+                <w:r>
+                  <w:rPr>
+                    <w:rFonts w:ascii="Arial" w:hAnsi="Arial" w:cs="Arial"/>
+                    <w:b/>
+                    <w:sz w:val="24"/>
+                    <w:szCs w:val="24"/>
+                  </w:rPr>
+                  <w:t>packing_slip</w:t>
+                </w:r>
+                <w:proofErr w:type="spellEnd"/>
+                <w:r>
+                  <w:rPr>
+                    <w:rFonts w:ascii="Arial" w:hAnsi="Arial" w:cs="Arial"/>
+                    <w:b/>
+                    <w:sz w:val="24"/>
+                    <w:szCs w:val="24"/>
+                  </w:rPr>
+                  <w:t>}}</w:t>
                 </w:r>
               </w:p>
             </w:tc>
@@ -1025,6 +1174,7 @@
               </w:rPr>
               <w:t>{{</w:t>
             </w:r>
+            <w:proofErr w:type="spellStart"/>
             <w:r>
               <w:rPr>
                 <w:rFonts w:ascii="Arial" w:hAnsi="Arial" w:cs="Arial"/>
@@ -1035,6 +1185,7 @@
               </w:rPr>
               <w:t>sales_order</w:t>
             </w:r>
+            <w:proofErr w:type="spellEnd"/>
             <w:r>
               <w:rPr>
                 <w:rFonts w:ascii="Arial" w:hAnsi="Arial" w:cs="Arial"/>
@@ -1095,7 +1246,29 @@
                 <w:sz w:val="24"/>
                 <w:szCs w:val="24"/>
               </w:rPr>
-              <w:t>{{date_code}}</w:t>
+              <w:t>{{</w:t>
+            </w:r>
+            <w:proofErr w:type="spellStart"/>
+            <w:r>
+              <w:rPr>
+                <w:rFonts w:ascii="Arial" w:hAnsi="Arial" w:cs="Arial"/>
+                <w:b/>
+                <w:bCs/>
+                <w:sz w:val="24"/>
+                <w:szCs w:val="24"/>
+              </w:rPr>
+              <w:t>date_code</w:t>
+            </w:r>
+            <w:proofErr w:type="spellEnd"/>
+            <w:r>
+              <w:rPr>
+                <w:rFonts w:ascii="Arial" w:hAnsi="Arial" w:cs="Arial"/>
+                <w:b/>
+                <w:bCs/>
+                <w:sz w:val="24"/>
+                <w:szCs w:val="24"/>
+              </w:rPr>
+              <w:t>}}</w:t>
             </w:r>
           </w:p>
         </w:tc>
@@ -1160,7 +1333,27 @@
                     <w:sz w:val="24"/>
                     <w:szCs w:val="28"/>
                   </w:rPr>
-                  <w:t>{{part_number}}</w:t>
+                  <w:t>{{</w:t>
+                </w:r>
+                <w:proofErr w:type="spellStart"/>
+                <w:r>
+                  <w:rPr>
+                    <w:rFonts w:ascii="Arial" w:hAnsi="Arial" w:cs="Arial"/>
+                    <w:b/>
+                    <w:sz w:val="24"/>
+                    <w:szCs w:val="28"/>
+                  </w:rPr>
+                  <w:t>part_number</w:t>
+                </w:r>
+                <w:proofErr w:type="spellEnd"/>
+                <w:r>
+                  <w:rPr>
+                    <w:rFonts w:ascii="Arial" w:hAnsi="Arial" w:cs="Arial"/>
+                    <w:b/>
+                    <w:sz w:val="24"/>
+                    <w:szCs w:val="28"/>
+                  </w:rPr>
+                  <w:t>}}</w:t>
                 </w:r>
               </w:p>
             </w:tc>
@@ -1293,7 +1486,27 @@
                     <w:sz w:val="24"/>
                     <w:szCs w:val="28"/>
                   </w:rPr>
-                  <w:t>{{drawing_no}}</w:t>
+                  <w:t>{{</w:t>
+                </w:r>
+                <w:proofErr w:type="spellStart"/>
+                <w:r>
+                  <w:rPr>
+                    <w:rFonts w:ascii="Arial" w:hAnsi="Arial" w:cs="Arial"/>
+                    <w:b/>
+                    <w:sz w:val="24"/>
+                    <w:szCs w:val="28"/>
+                  </w:rPr>
+                  <w:t>drawing_no</w:t>
+                </w:r>
+                <w:proofErr w:type="spellEnd"/>
+                <w:r>
+                  <w:rPr>
+                    <w:rFonts w:ascii="Arial" w:hAnsi="Arial" w:cs="Arial"/>
+                    <w:b/>
+                    <w:sz w:val="24"/>
+                    <w:szCs w:val="28"/>
+                  </w:rPr>
+                  <w:t>}}</w:t>
                 </w:r>
               </w:p>
             </w:tc>
@@ -1347,7 +1560,29 @@
                 <w:sz w:val="24"/>
                 <w:szCs w:val="24"/>
               </w:rPr>
-              <w:t>{{work_order}}</w:t>
+              <w:t>{{</w:t>
+            </w:r>
+            <w:proofErr w:type="spellStart"/>
+            <w:r>
+              <w:rPr>
+                <w:rFonts w:ascii="Arial" w:hAnsi="Arial" w:cs="Arial"/>
+                <w:b/>
+                <w:bCs/>
+                <w:sz w:val="24"/>
+                <w:szCs w:val="24"/>
+              </w:rPr>
+              <w:t>work_order</w:t>
+            </w:r>
+            <w:proofErr w:type="spellEnd"/>
+            <w:r>
+              <w:rPr>
+                <w:rFonts w:ascii="Arial" w:hAnsi="Arial" w:cs="Arial"/>
+                <w:b/>
+                <w:bCs/>
+                <w:sz w:val="24"/>
+                <w:szCs w:val="24"/>
+              </w:rPr>
+              <w:t>}}</w:t>
             </w:r>
           </w:p>
         </w:tc>
@@ -1428,6 +1663,7 @@
             </w:rPr>
             <w:t>{{</w:t>
           </w:r>
+          <w:proofErr w:type="spellStart"/>
           <w:r>
             <w:rPr>
               <w:rFonts w:ascii="Arial" w:hAnsi="Arial" w:cs="Arial"/>
@@ -1455,6 +1691,7 @@
             </w:rPr>
             <w:t>umbers</w:t>
           </w:r>
+          <w:proofErr w:type="spellEnd"/>
           <w:r>
             <w:rPr>
               <w:rFonts w:ascii="Arial" w:hAnsi="Arial" w:cs="Arial"/>
@@ -3304,6 +3541,7 @@
     <w:rsid w:val="000D41DB"/>
     <w:rsid w:val="000F5767"/>
     <w:rsid w:val="00133C55"/>
+    <w:rsid w:val="001E2C72"/>
     <w:rsid w:val="00204C97"/>
     <w:rsid w:val="00240941"/>
     <w:rsid w:val="00290955"/>
@@ -3332,6 +3570,7 @@
     <w:rsid w:val="00EB1D2A"/>
     <w:rsid w:val="00EE6727"/>
     <w:rsid w:val="00F13133"/>
+    <w:rsid w:val="00F1386C"/>
     <w:rsid w:val="00F75D64"/>
     <w:rsid w:val="00F93C02"/>
     <w:rsid w:val="00F95D93"/>

</xml_diff>